<commit_message>
Bám sát FSC cho bộ biểu mẫu Word; thêm BM-TV-08, BM-FSC-11, BM-FSC-12
- Gắn tham chiếu FSC-STD-40-005 V3-1, FSC-STD-40-004 V3-1, FSC-CNRA-VN V1-0
  và nhãn nhóm rủi ro CW1–CW5 vào các tiêu chí.
- BM-FSC-09 đánh giá rủi ro theo 5 nhóm CW (gồm HCV1–6), biện pháp kiểm soát.
- BM-FSC-07 bổ sung yêu cầu tuyên bố FSC trên hóa đơn (40-004 mục 5.1).
- Biên bản tham vấn: sự đồng thuận, nhóm rủi ro, kiến nghị/khiếu nại,
  câu hỏi lao động cốt lõi; thêm BM-TV-08 Trưởng thôn.
- Mới: BM-FSC-11 Sổ tiếp nhận & xử lý khiếu nại,
  BM-FSC-12 Tự đánh giá yêu cầu lao động cốt lõi FSC.

Co-Authored-By: Claude Opus 5.5 <noreply@anthropic.com>
Claude-Session: https://claude.ai/code/session_01VbMjqyC36vu12kFKQxsoig
</commit_message>
<xml_diff>
--- a/Bieu_mau_Word/BM-FSC-01_Phieu_tham_dinh_chu_rung_vung_cung_ung.docx
+++ b/Bieu_mau_Word/BM-FSC-01_Phieu_tham_dinh_chu_rung_vung_cung_ung.docx
@@ -109,7 +109,7 @@
     </w:tbl>
     <w:p>
       <w:pPr>
-        <w:spacing w:after="60" w:before="60" w:line="264"/>
+        <w:spacing w:after="20" w:before="60" w:line="264"/>
       </w:pPr>
       <w:r>
         <w:rPr>
@@ -134,6 +134,35 @@
           <w:szCs w:val="21"/>
         </w:rPr>
         <w:t xml:space="preserve">Xác minh tính hợp pháp của chủ rừng và vùng nguyên liệu trước khi thu mua.</w:t>
+      </w:r>
+    </w:p>
+    <w:p>
+      <w:pPr>
+        <w:spacing w:after="60" w:before="0" w:line="264"/>
+      </w:pPr>
+      <w:r>
+        <w:rPr>
+          <w:rFonts w:ascii="Times New Roman" w:cs="Times New Roman" w:eastAsia="Times New Roman" w:hAnsi="Times New Roman"/>
+          <w:b/>
+          <w:bCs/>
+          <w:i/>
+          <w:iCs/>
+          <w:color w:val="2E75B6"/>
+          <w:sz w:val="21"/>
+          <w:szCs w:val="21"/>
+        </w:rPr>
+        <w:t xml:space="preserve">Tham chiếu FSC: </w:t>
+      </w:r>
+      <w:r>
+        <w:rPr>
+          <w:rFonts w:ascii="Times New Roman" w:cs="Times New Roman" w:eastAsia="Times New Roman" w:hAnsi="Times New Roman"/>
+          <w:i/>
+          <w:iCs/>
+          <w:color w:val="404040"/>
+          <w:sz w:val="21"/>
+          <w:szCs w:val="21"/>
+        </w:rPr>
+        <w:t xml:space="preserve">FSC-STD-40-005 V3-1 — Hệ thống thẩm định (DDS): thu thập thông tin nguyên liệu (mục 2.1), đánh giá rủi ro theo FSC-CNRA-VN V1-0.</w:t>
       </w:r>
     </w:p>
     <w:p>
@@ -218,7 +247,7 @@
                 <w:sz w:val="22"/>
                 <w:szCs w:val="22"/>
               </w:rPr>
-              <w:t xml:space="preserve">Họ tên chủ rừng</w:t>
+              <w:t xml:space="preserve">Họ tên chủ rừng (nhà cung cấp)</w:t>
             </w:r>
           </w:p>
         </w:tc>
@@ -679,6 +708,150 @@
                 <w:szCs w:val="22"/>
               </w:rPr>
               <w:t xml:space="preserve">Kinh độ: …………………………   Vĩ độ: …………………………</w:t>
+            </w:r>
+          </w:p>
+        </w:tc>
+      </w:tr>
+      <w:tr>
+        <w:trPr>
+          <w:cantSplit/>
+          <w:trHeight w:val="400" w:hRule="atLeast"/>
+        </w:trPr>
+        <w:tc>
+          <w:tcPr>
+            <w:tcW w:type="dxa" w:w="3500"/>
+            <w:tcBorders>
+              <w:top w:val="single" w:color="7F7F7F" w:sz="4"/>
+              <w:left w:val="single" w:color="7F7F7F" w:sz="4"/>
+              <w:bottom w:val="single" w:color="7F7F7F" w:sz="4"/>
+              <w:right w:val="single" w:color="7F7F7F" w:sz="4"/>
+            </w:tcBorders>
+            <w:shd w:fill="DEEAF6" w:color="auto" w:val="clear"/>
+            <w:tcMar>
+              <w:top w:type="dxa" w:w="50"/>
+              <w:left w:type="dxa" w:w="100"/>
+              <w:bottom w:type="dxa" w:w="50"/>
+              <w:right w:type="dxa" w:w="100"/>
+            </w:tcMar>
+            <w:vAlign w:val="center"/>
+          </w:tcPr>
+          <w:p>
+            <w:pPr>
+              <w:spacing w:after="40" w:before="0" w:line="264"/>
+            </w:pPr>
+            <w:r>
+              <w:rPr>
+                <w:rFonts w:ascii="Times New Roman" w:cs="Times New Roman" w:eastAsia="Times New Roman" w:hAnsi="Times New Roman"/>
+                <w:b/>
+                <w:bCs/>
+                <w:sz w:val="22"/>
+                <w:szCs w:val="22"/>
+              </w:rPr>
+              <w:t xml:space="preserve">Loài cây (tên thường / tên khoa học)</w:t>
+            </w:r>
+          </w:p>
+        </w:tc>
+        <w:tc>
+          <w:tcPr>
+            <w:tcW w:type="dxa" w:w="6138"/>
+            <w:tcBorders>
+              <w:top w:val="single" w:color="7F7F7F" w:sz="4"/>
+              <w:left w:val="single" w:color="7F7F7F" w:sz="4"/>
+              <w:bottom w:val="single" w:color="7F7F7F" w:sz="4"/>
+              <w:right w:val="single" w:color="7F7F7F" w:sz="4"/>
+            </w:tcBorders>
+            <w:tcMar>
+              <w:top w:type="dxa" w:w="50"/>
+              <w:left w:type="dxa" w:w="100"/>
+              <w:bottom w:type="dxa" w:w="50"/>
+              <w:right w:type="dxa" w:w="100"/>
+            </w:tcMar>
+            <w:vAlign w:val="center"/>
+          </w:tcPr>
+          <w:p>
+            <w:pPr>
+              <w:spacing w:after="40" w:before="0" w:line="264"/>
+            </w:pPr>
+            <w:r>
+              <w:rPr>
+                <w:rFonts w:ascii="Times New Roman" w:cs="Times New Roman" w:eastAsia="Times New Roman" w:hAnsi="Times New Roman"/>
+                <w:color w:val="595959"/>
+                <w:sz w:val="22"/>
+                <w:szCs w:val="22"/>
+              </w:rPr>
+              <w:t xml:space="preserve">☐ Keo tai tượng (Acacia mangium)   ☐ Keo lá tràm (A. auriculiformis)   ☐ Keo lai   ☐ Khác: …………</w:t>
+            </w:r>
+          </w:p>
+        </w:tc>
+      </w:tr>
+      <w:tr>
+        <w:trPr>
+          <w:cantSplit/>
+          <w:trHeight w:val="400" w:hRule="atLeast"/>
+        </w:trPr>
+        <w:tc>
+          <w:tcPr>
+            <w:tcW w:type="dxa" w:w="3500"/>
+            <w:tcBorders>
+              <w:top w:val="single" w:color="7F7F7F" w:sz="4"/>
+              <w:left w:val="single" w:color="7F7F7F" w:sz="4"/>
+              <w:bottom w:val="single" w:color="7F7F7F" w:sz="4"/>
+              <w:right w:val="single" w:color="7F7F7F" w:sz="4"/>
+            </w:tcBorders>
+            <w:shd w:fill="DEEAF6" w:color="auto" w:val="clear"/>
+            <w:tcMar>
+              <w:top w:type="dxa" w:w="50"/>
+              <w:left w:type="dxa" w:w="100"/>
+              <w:bottom w:type="dxa" w:w="50"/>
+              <w:right w:type="dxa" w:w="100"/>
+            </w:tcMar>
+            <w:vAlign w:val="center"/>
+          </w:tcPr>
+          <w:p>
+            <w:pPr>
+              <w:spacing w:after="40" w:before="0" w:line="264"/>
+            </w:pPr>
+            <w:r>
+              <w:rPr>
+                <w:rFonts w:ascii="Times New Roman" w:cs="Times New Roman" w:eastAsia="Times New Roman" w:hAnsi="Times New Roman"/>
+                <w:b/>
+                <w:bCs/>
+                <w:sz w:val="22"/>
+                <w:szCs w:val="22"/>
+              </w:rPr>
+              <w:t xml:space="preserve">Tuổi rừng / Khối lượng dự kiến</w:t>
+            </w:r>
+          </w:p>
+        </w:tc>
+        <w:tc>
+          <w:tcPr>
+            <w:tcW w:type="dxa" w:w="6138"/>
+            <w:tcBorders>
+              <w:top w:val="single" w:color="7F7F7F" w:sz="4"/>
+              <w:left w:val="single" w:color="7F7F7F" w:sz="4"/>
+              <w:bottom w:val="single" w:color="7F7F7F" w:sz="4"/>
+              <w:right w:val="single" w:color="7F7F7F" w:sz="4"/>
+            </w:tcBorders>
+            <w:tcMar>
+              <w:top w:type="dxa" w:w="50"/>
+              <w:left w:type="dxa" w:w="100"/>
+              <w:bottom w:type="dxa" w:w="50"/>
+              <w:right w:type="dxa" w:w="100"/>
+            </w:tcMar>
+            <w:vAlign w:val="center"/>
+          </w:tcPr>
+          <w:p>
+            <w:pPr>
+              <w:spacing w:after="40" w:before="0" w:line="264"/>
+            </w:pPr>
+            <w:r>
+              <w:rPr>
+                <w:rFonts w:ascii="Times New Roman" w:cs="Times New Roman" w:eastAsia="Times New Roman" w:hAnsi="Times New Roman"/>
+                <w:color w:val="595959"/>
+                <w:sz w:val="22"/>
+                <w:szCs w:val="22"/>
+              </w:rPr>
+              <w:t xml:space="preserve">……… năm   |   ……………… tấn</w:t>
             </w:r>
           </w:p>
         </w:tc>
@@ -983,7 +1156,18 @@
                 <w:sz w:val="22"/>
                 <w:szCs w:val="22"/>
               </w:rPr>
-              <w:t xml:space="preserve">Mục đích sử dụng đất là rừng sản xuất / trồng cây lâu năm / lâm nghiệp (KHÔNG phải rừng phòng hộ, rừng tự nhiên, rừng đặc dụng, khoanh nuôi bảo vệ).</w:t>
+              <w:t xml:space="preserve">Mục đích sử dụng đất là rừng sản xuất / trồng cây lâu năm / lâm nghiệp (KHÔNG phải rừng phòng hộ, rừng tự nhiên, rừng đặc dụng, khoanh nuôi bảo vệ). </w:t>
+            </w:r>
+            <w:r>
+              <w:rPr>
+                <w:rFonts w:ascii="Times New Roman" w:cs="Times New Roman" w:eastAsia="Times New Roman" w:hAnsi="Times New Roman"/>
+                <w:b/>
+                <w:bCs/>
+                <w:color w:val="2E75B6"/>
+                <w:sz w:val="18"/>
+                <w:szCs w:val="18"/>
+              </w:rPr>
+              <w:t xml:space="preserve">[CW1·CW3]</w:t>
             </w:r>
           </w:p>
         </w:tc>
@@ -1149,7 +1333,18 @@
                 <w:sz w:val="22"/>
                 <w:szCs w:val="22"/>
               </w:rPr>
-              <w:t xml:space="preserve">Sổ đỏ / hồ sơ giao đất còn hạn khai thác (chu kỳ 4–7 năm), không trùng năm khai thác trước.</w:t>
+              <w:t xml:space="preserve">Sổ đỏ / hồ sơ giao đất còn hạn khai thác (chu kỳ 4–7 năm), không trùng năm khai thác trước. </w:t>
+            </w:r>
+            <w:r>
+              <w:rPr>
+                <w:rFonts w:ascii="Times New Roman" w:cs="Times New Roman" w:eastAsia="Times New Roman" w:hAnsi="Times New Roman"/>
+                <w:b/>
+                <w:bCs/>
+                <w:color w:val="2E75B6"/>
+                <w:sz w:val="18"/>
+                <w:szCs w:val="18"/>
+              </w:rPr>
+              <w:t xml:space="preserve">[CW1]</w:t>
             </w:r>
           </w:p>
         </w:tc>
@@ -1316,7 +1511,18 @@
                 <w:sz w:val="22"/>
                 <w:szCs w:val="22"/>
               </w:rPr>
-              <w:t xml:space="preserve">CCCD của chủ rừng còn hiệu lực.</w:t>
+              <w:t xml:space="preserve">CCCD của chủ rừng còn hiệu lực, đúng tên trên sổ đỏ / hồ sơ giao đất. </w:t>
+            </w:r>
+            <w:r>
+              <w:rPr>
+                <w:rFonts w:ascii="Times New Roman" w:cs="Times New Roman" w:eastAsia="Times New Roman" w:hAnsi="Times New Roman"/>
+                <w:b/>
+                <w:bCs/>
+                <w:color w:val="2E75B6"/>
+                <w:sz w:val="18"/>
+                <w:szCs w:val="18"/>
+              </w:rPr>
+              <w:t xml:space="preserve">[CW1]</w:t>
             </w:r>
           </w:p>
         </w:tc>
@@ -1482,7 +1688,18 @@
                 <w:sz w:val="22"/>
                 <w:szCs w:val="22"/>
               </w:rPr>
-              <w:t xml:space="preserve">Vùng không thuộc khu vực rừng tự nhiên chuyển đổi sang rừng trồng sau 31/12/2020 (theo bản đồ / ảnh viễn thám rà soát).</w:t>
+              <w:t xml:space="preserve">Vùng không thuộc khu vực rừng tự nhiên chuyển đổi sang rừng trồng sau 31/12/2020 (theo bản đồ / ảnh viễn thám rà soát). </w:t>
+            </w:r>
+            <w:r>
+              <w:rPr>
+                <w:rFonts w:ascii="Times New Roman" w:cs="Times New Roman" w:eastAsia="Times New Roman" w:hAnsi="Times New Roman"/>
+                <w:b/>
+                <w:bCs/>
+                <w:color w:val="2E75B6"/>
+                <w:sz w:val="18"/>
+                <w:szCs w:val="18"/>
+              </w:rPr>
+              <w:t xml:space="preserve">[CW4]</w:t>
             </w:r>
           </w:p>
         </w:tc>
@@ -1649,7 +1866,18 @@
                 <w:sz w:val="22"/>
                 <w:szCs w:val="22"/>
               </w:rPr>
-              <w:t xml:space="preserve">Không có dấu hiệu tranh chấp đất đai tại khu vực.</w:t>
+              <w:t xml:space="preserve">Không có dấu hiệu tranh chấp đất đai tại khu vực. </w:t>
+            </w:r>
+            <w:r>
+              <w:rPr>
+                <w:rFonts w:ascii="Times New Roman" w:cs="Times New Roman" w:eastAsia="Times New Roman" w:hAnsi="Times New Roman"/>
+                <w:b/>
+                <w:bCs/>
+                <w:color w:val="2E75B6"/>
+                <w:sz w:val="18"/>
+                <w:szCs w:val="18"/>
+              </w:rPr>
+              <w:t xml:space="preserve">[CW1·CW2]</w:t>
             </w:r>
           </w:p>
         </w:tc>
@@ -1749,7 +1977,571 @@
           </w:p>
         </w:tc>
       </w:tr>
+      <w:tr>
+        <w:trPr>
+          <w:cantSplit/>
+          <w:trHeight w:val="420" w:hRule="atLeast"/>
+        </w:trPr>
+        <w:tc>
+          <w:tcPr>
+            <w:tcW w:type="dxa" w:w="640"/>
+            <w:tcBorders>
+              <w:top w:val="single" w:color="7F7F7F" w:sz="4"/>
+              <w:left w:val="single" w:color="7F7F7F" w:sz="4"/>
+              <w:bottom w:val="single" w:color="7F7F7F" w:sz="4"/>
+              <w:right w:val="single" w:color="7F7F7F" w:sz="4"/>
+            </w:tcBorders>
+            <w:shd w:fill="F5F8FC" w:color="auto" w:val="clear"/>
+            <w:tcMar>
+              <w:top w:type="dxa" w:w="50"/>
+              <w:left w:type="dxa" w:w="100"/>
+              <w:bottom w:type="dxa" w:w="50"/>
+              <w:right w:type="dxa" w:w="100"/>
+            </w:tcMar>
+            <w:vAlign w:val="center"/>
+          </w:tcPr>
+          <w:p>
+            <w:pPr>
+              <w:spacing w:after="40" w:before="0" w:line="264"/>
+              <w:jc w:val="center"/>
+            </w:pPr>
+            <w:r>
+              <w:rPr>
+                <w:rFonts w:ascii="Times New Roman" w:cs="Times New Roman" w:eastAsia="Times New Roman" w:hAnsi="Times New Roman"/>
+                <w:sz w:val="22"/>
+                <w:szCs w:val="22"/>
+              </w:rPr>
+              <w:t xml:space="preserve">6</w:t>
+            </w:r>
+          </w:p>
+        </w:tc>
+        <w:tc>
+          <w:tcPr>
+            <w:tcW w:type="dxa" w:w="5298"/>
+            <w:tcBorders>
+              <w:top w:val="single" w:color="7F7F7F" w:sz="4"/>
+              <w:left w:val="single" w:color="7F7F7F" w:sz="4"/>
+              <w:bottom w:val="single" w:color="7F7F7F" w:sz="4"/>
+              <w:right w:val="single" w:color="7F7F7F" w:sz="4"/>
+            </w:tcBorders>
+            <w:shd w:fill="F5F8FC" w:color="auto" w:val="clear"/>
+            <w:tcMar>
+              <w:top w:type="dxa" w:w="50"/>
+              <w:left w:type="dxa" w:w="100"/>
+              <w:bottom w:type="dxa" w:w="50"/>
+              <w:right w:type="dxa" w:w="100"/>
+            </w:tcMar>
+            <w:vAlign w:val="center"/>
+          </w:tcPr>
+          <w:p>
+            <w:pPr>
+              <w:spacing w:after="40" w:before="0" w:line="264"/>
+            </w:pPr>
+            <w:r>
+              <w:rPr>
+                <w:rFonts w:ascii="Times New Roman" w:cs="Times New Roman" w:eastAsia="Times New Roman" w:hAnsi="Times New Roman"/>
+                <w:sz w:val="22"/>
+                <w:szCs w:val="22"/>
+              </w:rPr>
+              <w:t xml:space="preserve">Không có khiếu nại về vi phạm quyền của cộng đồng địa phương, người dân tộc thiểu số, người lao động tại khu vực. </w:t>
+            </w:r>
+            <w:r>
+              <w:rPr>
+                <w:rFonts w:ascii="Times New Roman" w:cs="Times New Roman" w:eastAsia="Times New Roman" w:hAnsi="Times New Roman"/>
+                <w:b/>
+                <w:bCs/>
+                <w:color w:val="2E75B6"/>
+                <w:sz w:val="18"/>
+                <w:szCs w:val="18"/>
+              </w:rPr>
+              <w:t xml:space="preserve">[CW2]</w:t>
+            </w:r>
+          </w:p>
+        </w:tc>
+        <w:tc>
+          <w:tcPr>
+            <w:tcW w:type="dxa" w:w="1000"/>
+            <w:tcBorders>
+              <w:top w:val="single" w:color="7F7F7F" w:sz="4"/>
+              <w:left w:val="single" w:color="7F7F7F" w:sz="4"/>
+              <w:bottom w:val="single" w:color="7F7F7F" w:sz="4"/>
+              <w:right w:val="single" w:color="7F7F7F" w:sz="4"/>
+            </w:tcBorders>
+            <w:shd w:fill="F5F8FC" w:color="auto" w:val="clear"/>
+            <w:tcMar>
+              <w:top w:type="dxa" w:w="50"/>
+              <w:left w:type="dxa" w:w="100"/>
+              <w:bottom w:type="dxa" w:w="50"/>
+              <w:right w:type="dxa" w:w="100"/>
+            </w:tcMar>
+            <w:vAlign w:val="center"/>
+          </w:tcPr>
+          <w:p>
+            <w:pPr>
+              <w:spacing w:after="40" w:before="0" w:line="264"/>
+              <w:jc w:val="center"/>
+            </w:pPr>
+            <w:r>
+              <w:rPr>
+                <w:rFonts w:ascii="Times New Roman" w:cs="Times New Roman" w:eastAsia="Times New Roman" w:hAnsi="Times New Roman"/>
+                <w:sz w:val="28"/>
+                <w:szCs w:val="28"/>
+              </w:rPr>
+              <w:t xml:space="preserve">☐</w:t>
+            </w:r>
+          </w:p>
+        </w:tc>
+        <w:tc>
+          <w:tcPr>
+            <w:tcW w:type="dxa" w:w="1000"/>
+            <w:tcBorders>
+              <w:top w:val="single" w:color="7F7F7F" w:sz="4"/>
+              <w:left w:val="single" w:color="7F7F7F" w:sz="4"/>
+              <w:bottom w:val="single" w:color="7F7F7F" w:sz="4"/>
+              <w:right w:val="single" w:color="7F7F7F" w:sz="4"/>
+            </w:tcBorders>
+            <w:shd w:fill="F5F8FC" w:color="auto" w:val="clear"/>
+            <w:tcMar>
+              <w:top w:type="dxa" w:w="50"/>
+              <w:left w:type="dxa" w:w="100"/>
+              <w:bottom w:type="dxa" w:w="50"/>
+              <w:right w:type="dxa" w:w="100"/>
+            </w:tcMar>
+            <w:vAlign w:val="center"/>
+          </w:tcPr>
+          <w:p>
+            <w:pPr>
+              <w:spacing w:after="40" w:before="0" w:line="264"/>
+              <w:jc w:val="center"/>
+            </w:pPr>
+            <w:r>
+              <w:rPr>
+                <w:rFonts w:ascii="Times New Roman" w:cs="Times New Roman" w:eastAsia="Times New Roman" w:hAnsi="Times New Roman"/>
+                <w:sz w:val="28"/>
+                <w:szCs w:val="28"/>
+              </w:rPr>
+              <w:t xml:space="preserve">☐</w:t>
+            </w:r>
+          </w:p>
+        </w:tc>
+        <w:tc>
+          <w:tcPr>
+            <w:tcW w:type="dxa" w:w="1700"/>
+            <w:tcBorders>
+              <w:top w:val="single" w:color="7F7F7F" w:sz="4"/>
+              <w:left w:val="single" w:color="7F7F7F" w:sz="4"/>
+              <w:bottom w:val="single" w:color="7F7F7F" w:sz="4"/>
+              <w:right w:val="single" w:color="7F7F7F" w:sz="4"/>
+            </w:tcBorders>
+            <w:shd w:fill="F5F8FC" w:color="auto" w:val="clear"/>
+            <w:tcMar>
+              <w:top w:type="dxa" w:w="50"/>
+              <w:left w:type="dxa" w:w="100"/>
+              <w:bottom w:type="dxa" w:w="50"/>
+              <w:right w:type="dxa" w:w="100"/>
+            </w:tcMar>
+            <w:vAlign w:val="center"/>
+          </w:tcPr>
+          <w:p>
+            <w:pPr>
+              <w:spacing w:after="40" w:before="0" w:line="264"/>
+            </w:pPr>
+            <w:r>
+              <w:rPr>
+                <w:rFonts w:ascii="Times New Roman" w:cs="Times New Roman" w:eastAsia="Times New Roman" w:hAnsi="Times New Roman"/>
+                <w:sz w:val="23"/>
+                <w:szCs w:val="23"/>
+              </w:rPr>
+              <w:t xml:space="preserve"/>
+            </w:r>
+          </w:p>
+        </w:tc>
+      </w:tr>
+      <w:tr>
+        <w:trPr>
+          <w:cantSplit/>
+          <w:trHeight w:val="420" w:hRule="atLeast"/>
+        </w:trPr>
+        <w:tc>
+          <w:tcPr>
+            <w:tcW w:type="dxa" w:w="640"/>
+            <w:tcBorders>
+              <w:top w:val="single" w:color="7F7F7F" w:sz="4"/>
+              <w:left w:val="single" w:color="7F7F7F" w:sz="4"/>
+              <w:bottom w:val="single" w:color="7F7F7F" w:sz="4"/>
+              <w:right w:val="single" w:color="7F7F7F" w:sz="4"/>
+            </w:tcBorders>
+            <w:tcMar>
+              <w:top w:type="dxa" w:w="50"/>
+              <w:left w:type="dxa" w:w="100"/>
+              <w:bottom w:type="dxa" w:w="50"/>
+              <w:right w:type="dxa" w:w="100"/>
+            </w:tcMar>
+            <w:vAlign w:val="center"/>
+          </w:tcPr>
+          <w:p>
+            <w:pPr>
+              <w:spacing w:after="40" w:before="0" w:line="264"/>
+              <w:jc w:val="center"/>
+            </w:pPr>
+            <w:r>
+              <w:rPr>
+                <w:rFonts w:ascii="Times New Roman" w:cs="Times New Roman" w:eastAsia="Times New Roman" w:hAnsi="Times New Roman"/>
+                <w:sz w:val="22"/>
+                <w:szCs w:val="22"/>
+              </w:rPr>
+              <w:t xml:space="preserve">7</w:t>
+            </w:r>
+          </w:p>
+        </w:tc>
+        <w:tc>
+          <w:tcPr>
+            <w:tcW w:type="dxa" w:w="5298"/>
+            <w:tcBorders>
+              <w:top w:val="single" w:color="7F7F7F" w:sz="4"/>
+              <w:left w:val="single" w:color="7F7F7F" w:sz="4"/>
+              <w:bottom w:val="single" w:color="7F7F7F" w:sz="4"/>
+              <w:right w:val="single" w:color="7F7F7F" w:sz="4"/>
+            </w:tcBorders>
+            <w:tcMar>
+              <w:top w:type="dxa" w:w="50"/>
+              <w:left w:type="dxa" w:w="100"/>
+              <w:bottom w:type="dxa" w:w="50"/>
+              <w:right w:type="dxa" w:w="100"/>
+            </w:tcMar>
+            <w:vAlign w:val="center"/>
+          </w:tcPr>
+          <w:p>
+            <w:pPr>
+              <w:spacing w:after="40" w:before="0" w:line="264"/>
+            </w:pPr>
+            <w:r>
+              <w:rPr>
+                <w:rFonts w:ascii="Times New Roman" w:cs="Times New Roman" w:eastAsia="Times New Roman" w:hAnsi="Times New Roman"/>
+                <w:sz w:val="22"/>
+                <w:szCs w:val="22"/>
+              </w:rPr>
+              <w:t xml:space="preserve">Lô rừng không nằm trong / không đe dọa khu vực có giá trị bảo tồn cao (HCV); hành lang ven suối được duy trì. </w:t>
+            </w:r>
+            <w:r>
+              <w:rPr>
+                <w:rFonts w:ascii="Times New Roman" w:cs="Times New Roman" w:eastAsia="Times New Roman" w:hAnsi="Times New Roman"/>
+                <w:b/>
+                <w:bCs/>
+                <w:color w:val="2E75B6"/>
+                <w:sz w:val="18"/>
+                <w:szCs w:val="18"/>
+              </w:rPr>
+              <w:t xml:space="preserve">[CW3]</w:t>
+            </w:r>
+          </w:p>
+        </w:tc>
+        <w:tc>
+          <w:tcPr>
+            <w:tcW w:type="dxa" w:w="1000"/>
+            <w:tcBorders>
+              <w:top w:val="single" w:color="7F7F7F" w:sz="4"/>
+              <w:left w:val="single" w:color="7F7F7F" w:sz="4"/>
+              <w:bottom w:val="single" w:color="7F7F7F" w:sz="4"/>
+              <w:right w:val="single" w:color="7F7F7F" w:sz="4"/>
+            </w:tcBorders>
+            <w:tcMar>
+              <w:top w:type="dxa" w:w="50"/>
+              <w:left w:type="dxa" w:w="100"/>
+              <w:bottom w:type="dxa" w:w="50"/>
+              <w:right w:type="dxa" w:w="100"/>
+            </w:tcMar>
+            <w:vAlign w:val="center"/>
+          </w:tcPr>
+          <w:p>
+            <w:pPr>
+              <w:spacing w:after="40" w:before="0" w:line="264"/>
+              <w:jc w:val="center"/>
+            </w:pPr>
+            <w:r>
+              <w:rPr>
+                <w:rFonts w:ascii="Times New Roman" w:cs="Times New Roman" w:eastAsia="Times New Roman" w:hAnsi="Times New Roman"/>
+                <w:sz w:val="28"/>
+                <w:szCs w:val="28"/>
+              </w:rPr>
+              <w:t xml:space="preserve">☐</w:t>
+            </w:r>
+          </w:p>
+        </w:tc>
+        <w:tc>
+          <w:tcPr>
+            <w:tcW w:type="dxa" w:w="1000"/>
+            <w:tcBorders>
+              <w:top w:val="single" w:color="7F7F7F" w:sz="4"/>
+              <w:left w:val="single" w:color="7F7F7F" w:sz="4"/>
+              <w:bottom w:val="single" w:color="7F7F7F" w:sz="4"/>
+              <w:right w:val="single" w:color="7F7F7F" w:sz="4"/>
+            </w:tcBorders>
+            <w:tcMar>
+              <w:top w:type="dxa" w:w="50"/>
+              <w:left w:type="dxa" w:w="100"/>
+              <w:bottom w:type="dxa" w:w="50"/>
+              <w:right w:type="dxa" w:w="100"/>
+            </w:tcMar>
+            <w:vAlign w:val="center"/>
+          </w:tcPr>
+          <w:p>
+            <w:pPr>
+              <w:spacing w:after="40" w:before="0" w:line="264"/>
+              <w:jc w:val="center"/>
+            </w:pPr>
+            <w:r>
+              <w:rPr>
+                <w:rFonts w:ascii="Times New Roman" w:cs="Times New Roman" w:eastAsia="Times New Roman" w:hAnsi="Times New Roman"/>
+                <w:sz w:val="28"/>
+                <w:szCs w:val="28"/>
+              </w:rPr>
+              <w:t xml:space="preserve">☐</w:t>
+            </w:r>
+          </w:p>
+        </w:tc>
+        <w:tc>
+          <w:tcPr>
+            <w:tcW w:type="dxa" w:w="1700"/>
+            <w:tcBorders>
+              <w:top w:val="single" w:color="7F7F7F" w:sz="4"/>
+              <w:left w:val="single" w:color="7F7F7F" w:sz="4"/>
+              <w:bottom w:val="single" w:color="7F7F7F" w:sz="4"/>
+              <w:right w:val="single" w:color="7F7F7F" w:sz="4"/>
+            </w:tcBorders>
+            <w:tcMar>
+              <w:top w:type="dxa" w:w="50"/>
+              <w:left w:type="dxa" w:w="100"/>
+              <w:bottom w:type="dxa" w:w="50"/>
+              <w:right w:type="dxa" w:w="100"/>
+            </w:tcMar>
+            <w:vAlign w:val="center"/>
+          </w:tcPr>
+          <w:p>
+            <w:pPr>
+              <w:spacing w:after="40" w:before="0" w:line="264"/>
+            </w:pPr>
+            <w:r>
+              <w:rPr>
+                <w:rFonts w:ascii="Times New Roman" w:cs="Times New Roman" w:eastAsia="Times New Roman" w:hAnsi="Times New Roman"/>
+                <w:sz w:val="23"/>
+                <w:szCs w:val="23"/>
+              </w:rPr>
+              <w:t xml:space="preserve"/>
+            </w:r>
+          </w:p>
+        </w:tc>
+      </w:tr>
+      <w:tr>
+        <w:trPr>
+          <w:cantSplit/>
+          <w:trHeight w:val="420" w:hRule="atLeast"/>
+        </w:trPr>
+        <w:tc>
+          <w:tcPr>
+            <w:tcW w:type="dxa" w:w="640"/>
+            <w:tcBorders>
+              <w:top w:val="single" w:color="7F7F7F" w:sz="4"/>
+              <w:left w:val="single" w:color="7F7F7F" w:sz="4"/>
+              <w:bottom w:val="single" w:color="7F7F7F" w:sz="4"/>
+              <w:right w:val="single" w:color="7F7F7F" w:sz="4"/>
+            </w:tcBorders>
+            <w:shd w:fill="F5F8FC" w:color="auto" w:val="clear"/>
+            <w:tcMar>
+              <w:top w:type="dxa" w:w="50"/>
+              <w:left w:type="dxa" w:w="100"/>
+              <w:bottom w:type="dxa" w:w="50"/>
+              <w:right w:type="dxa" w:w="100"/>
+            </w:tcMar>
+            <w:vAlign w:val="center"/>
+          </w:tcPr>
+          <w:p>
+            <w:pPr>
+              <w:spacing w:after="40" w:before="0" w:line="264"/>
+              <w:jc w:val="center"/>
+            </w:pPr>
+            <w:r>
+              <w:rPr>
+                <w:rFonts w:ascii="Times New Roman" w:cs="Times New Roman" w:eastAsia="Times New Roman" w:hAnsi="Times New Roman"/>
+                <w:sz w:val="22"/>
+                <w:szCs w:val="22"/>
+              </w:rPr>
+              <w:t xml:space="preserve">8</w:t>
+            </w:r>
+          </w:p>
+        </w:tc>
+        <w:tc>
+          <w:tcPr>
+            <w:tcW w:type="dxa" w:w="5298"/>
+            <w:tcBorders>
+              <w:top w:val="single" w:color="7F7F7F" w:sz="4"/>
+              <w:left w:val="single" w:color="7F7F7F" w:sz="4"/>
+              <w:bottom w:val="single" w:color="7F7F7F" w:sz="4"/>
+              <w:right w:val="single" w:color="7F7F7F" w:sz="4"/>
+            </w:tcBorders>
+            <w:shd w:fill="F5F8FC" w:color="auto" w:val="clear"/>
+            <w:tcMar>
+              <w:top w:type="dxa" w:w="50"/>
+              <w:left w:type="dxa" w:w="100"/>
+              <w:bottom w:type="dxa" w:w="50"/>
+              <w:right w:type="dxa" w:w="100"/>
+            </w:tcMar>
+            <w:vAlign w:val="center"/>
+          </w:tcPr>
+          <w:p>
+            <w:pPr>
+              <w:spacing w:after="40" w:before="0" w:line="264"/>
+            </w:pPr>
+            <w:r>
+              <w:rPr>
+                <w:rFonts w:ascii="Times New Roman" w:cs="Times New Roman" w:eastAsia="Times New Roman" w:hAnsi="Times New Roman"/>
+                <w:sz w:val="22"/>
+                <w:szCs w:val="22"/>
+              </w:rPr>
+              <w:t xml:space="preserve">Không trồng cây biến đổi gen (GMO). </w:t>
+            </w:r>
+            <w:r>
+              <w:rPr>
+                <w:rFonts w:ascii="Times New Roman" w:cs="Times New Roman" w:eastAsia="Times New Roman" w:hAnsi="Times New Roman"/>
+                <w:b/>
+                <w:bCs/>
+                <w:color w:val="2E75B6"/>
+                <w:sz w:val="18"/>
+                <w:szCs w:val="18"/>
+              </w:rPr>
+              <w:t xml:space="preserve">[CW5]</w:t>
+            </w:r>
+          </w:p>
+        </w:tc>
+        <w:tc>
+          <w:tcPr>
+            <w:tcW w:type="dxa" w:w="1000"/>
+            <w:tcBorders>
+              <w:top w:val="single" w:color="7F7F7F" w:sz="4"/>
+              <w:left w:val="single" w:color="7F7F7F" w:sz="4"/>
+              <w:bottom w:val="single" w:color="7F7F7F" w:sz="4"/>
+              <w:right w:val="single" w:color="7F7F7F" w:sz="4"/>
+            </w:tcBorders>
+            <w:shd w:fill="F5F8FC" w:color="auto" w:val="clear"/>
+            <w:tcMar>
+              <w:top w:type="dxa" w:w="50"/>
+              <w:left w:type="dxa" w:w="100"/>
+              <w:bottom w:type="dxa" w:w="50"/>
+              <w:right w:type="dxa" w:w="100"/>
+            </w:tcMar>
+            <w:vAlign w:val="center"/>
+          </w:tcPr>
+          <w:p>
+            <w:pPr>
+              <w:spacing w:after="40" w:before="0" w:line="264"/>
+              <w:jc w:val="center"/>
+            </w:pPr>
+            <w:r>
+              <w:rPr>
+                <w:rFonts w:ascii="Times New Roman" w:cs="Times New Roman" w:eastAsia="Times New Roman" w:hAnsi="Times New Roman"/>
+                <w:sz w:val="28"/>
+                <w:szCs w:val="28"/>
+              </w:rPr>
+              <w:t xml:space="preserve">☐</w:t>
+            </w:r>
+          </w:p>
+        </w:tc>
+        <w:tc>
+          <w:tcPr>
+            <w:tcW w:type="dxa" w:w="1000"/>
+            <w:tcBorders>
+              <w:top w:val="single" w:color="7F7F7F" w:sz="4"/>
+              <w:left w:val="single" w:color="7F7F7F" w:sz="4"/>
+              <w:bottom w:val="single" w:color="7F7F7F" w:sz="4"/>
+              <w:right w:val="single" w:color="7F7F7F" w:sz="4"/>
+            </w:tcBorders>
+            <w:shd w:fill="F5F8FC" w:color="auto" w:val="clear"/>
+            <w:tcMar>
+              <w:top w:type="dxa" w:w="50"/>
+              <w:left w:type="dxa" w:w="100"/>
+              <w:bottom w:type="dxa" w:w="50"/>
+              <w:right w:type="dxa" w:w="100"/>
+            </w:tcMar>
+            <w:vAlign w:val="center"/>
+          </w:tcPr>
+          <w:p>
+            <w:pPr>
+              <w:spacing w:after="40" w:before="0" w:line="264"/>
+              <w:jc w:val="center"/>
+            </w:pPr>
+            <w:r>
+              <w:rPr>
+                <w:rFonts w:ascii="Times New Roman" w:cs="Times New Roman" w:eastAsia="Times New Roman" w:hAnsi="Times New Roman"/>
+                <w:sz w:val="28"/>
+                <w:szCs w:val="28"/>
+              </w:rPr>
+              <w:t xml:space="preserve">☐</w:t>
+            </w:r>
+          </w:p>
+        </w:tc>
+        <w:tc>
+          <w:tcPr>
+            <w:tcW w:type="dxa" w:w="1700"/>
+            <w:tcBorders>
+              <w:top w:val="single" w:color="7F7F7F" w:sz="4"/>
+              <w:left w:val="single" w:color="7F7F7F" w:sz="4"/>
+              <w:bottom w:val="single" w:color="7F7F7F" w:sz="4"/>
+              <w:right w:val="single" w:color="7F7F7F" w:sz="4"/>
+            </w:tcBorders>
+            <w:shd w:fill="F5F8FC" w:color="auto" w:val="clear"/>
+            <w:tcMar>
+              <w:top w:type="dxa" w:w="50"/>
+              <w:left w:type="dxa" w:w="100"/>
+              <w:bottom w:type="dxa" w:w="50"/>
+              <w:right w:type="dxa" w:w="100"/>
+            </w:tcMar>
+            <w:vAlign w:val="center"/>
+          </w:tcPr>
+          <w:p>
+            <w:pPr>
+              <w:spacing w:after="40" w:before="0" w:line="264"/>
+            </w:pPr>
+            <w:r>
+              <w:rPr>
+                <w:rFonts w:ascii="Times New Roman" w:cs="Times New Roman" w:eastAsia="Times New Roman" w:hAnsi="Times New Roman"/>
+                <w:sz w:val="23"/>
+                <w:szCs w:val="23"/>
+              </w:rPr>
+              <w:t xml:space="preserve"/>
+            </w:r>
+          </w:p>
+        </w:tc>
+      </w:tr>
     </w:tbl>
+    <w:p>
+      <w:pPr>
+        <w:spacing w:after="80" w:before="0" w:line="264"/>
+      </w:pPr>
+      <w:r>
+        <w:rPr>
+          <w:rFonts w:ascii="Times New Roman" w:cs="Times New Roman" w:eastAsia="Times New Roman" w:hAnsi="Times New Roman"/>
+          <w:sz w:val="23"/>
+          <w:szCs w:val="23"/>
+        </w:rPr>
+        <w:t xml:space="preserve"/>
+      </w:r>
+    </w:p>
+    <w:p>
+      <w:pPr>
+        <w:spacing w:after="40" w:before="0" w:line="264"/>
+      </w:pPr>
+      <w:r>
+        <w:rPr>
+          <w:rFonts w:ascii="Times New Roman" w:cs="Times New Roman" w:eastAsia="Times New Roman" w:hAnsi="Times New Roman"/>
+          <w:i/>
+          <w:iCs/>
+          <w:color w:val="595959"/>
+          <w:sz w:val="20"/>
+          <w:szCs w:val="20"/>
+        </w:rPr>
+        <w:t xml:space="preserve">CW1 = khai thác bất hợp pháp · CW2 = vi phạm quyền truyền thống, quyền con người · CW3 = đe dọa giá trị bảo tồn cao (HCV) · CW4 = chuyển đổi rừng tự nhiên · CW5 = cây biến đổi gen (GMO).</w:t>
+      </w:r>
+    </w:p>
     <w:p>
       <w:pPr>
         <w:keepNext/>
@@ -1956,7 +2748,7 @@
       <w:tr>
         <w:trPr>
           <w:cantSplit/>
-          <w:trHeight w:val="960" w:hRule="atLeast"/>
+          <w:trHeight w:val="900" w:hRule="atLeast"/>
         </w:trPr>
         <w:tc>
           <w:tcPr>

</xml_diff>